<commit_message>
docs: add Section 12 (Team 5C Handover & Real-World Edge Deployment Specification)
</commit_message>
<xml_diff>
--- a/docs/Team_5B_Comprehensive_Project_Report.docx
+++ b/docs/Team_5B_Comprehensive_Project_Report.docx
@@ -5153,6 +5153,718 @@
         <w:br/>
       </w:r>
     </w:p>
+    <w:p>
+      <w:pPr>
+        <w:pStyle w:val="Heading1"/>
+      </w:pPr>
+      <w:r>
+        <w:rPr>
+          <w:color w:val="1A365D"/>
+        </w:rPr>
+        <w:t>12. Team 5C Handover &amp; Real-World Edge Deployment Specification</w:t>
+      </w:r>
+    </w:p>
+    <w:p>
+      <w:r>
+        <w:t>This section serves as the definitive handover guide for Team 5C (Downstream Telemetry Consumption &amp; System UI). It details the real-world operational architecture, how the edge pipeline connects to Team 5C's dashboard, the empirical model accuracy baseline, and the exact UI rendering rules required to handle incoming detections.</w:t>
+      </w:r>
+    </w:p>
+    <w:p>
+      <w:pPr>
+        <w:pStyle w:val="Heading2"/>
+      </w:pPr>
+      <w:r>
+        <w:t>12.1 Real-World Operational Architecture</w:t>
+      </w:r>
+    </w:p>
+    <w:p>
+      <w:r>
+        <w:t>In the production deployment environment, the end-to-end vision data flow operates across three physical layers:</w:t>
+        <w:br/>
+        <w:t>1. Physical Sensing Layer: Edge cameras stream video frames at field locations (agricultural drones, maritime coastal cameras, PCB inspection rigs).</w:t>
+        <w:br/>
+        <w:t>2. Team 5B Edge Processing Layer: The physical edge gateway (e.g., Raspberry Pi 5 or NVIDIA Jetson Orin Nano) runs our UnifiedInferenceRouter. It executes ONNX runtime inference, translates domain-local indices to global taxonomy (0..5), checks coordinate bounding limits, and structures payloads conforming to Team 5C's specification.</w:t>
+        <w:br/>
+        <w:t>3. Network Fault-Tolerant Transmission: In remote field environments where satellite, cellular, or WiFi drops occur, our MQTTTelemetryPublisher automatically captures messages in a 1,000-message in-memory circular ring buffer. When the connection to Team 5C's broker is restored, all queued messages flush automatically in strict FIFO order.</w:t>
+        <w:br/>
+        <w:t>4. Team 5C Mission Dashboard: Team 5C subscribes to the MQTT topic and visualizes live telemetry, bounding boxes, and system health metrics.</w:t>
+      </w:r>
+    </w:p>
+    <w:p>
+      <w:pPr>
+        <w:pStyle w:val="Heading2"/>
+      </w:pPr>
+      <w:r>
+        <w:t>12.2 Empirical Model Quality &amp; Accuracy Ground Truth</w:t>
+      </w:r>
+    </w:p>
+    <w:p>
+      <w:r>
+        <w:t>To ensure absolute transparency and engineering rigor, Team 5B conducted formal validation runs using Ultralytics YOLO.val on the actual model weights against the Synthline validation datasets. The empirical results are documented below:</w:t>
+      </w:r>
+    </w:p>
+    <w:tbl>
+      <w:tblPr>
+        <w:tblW w:type="auto" w:w="0"/>
+        <w:jc w:val="center"/>
+        <w:tblLayout w:type="fixed"/>
+        <w:tblLook w:firstColumn="1" w:firstRow="1" w:lastColumn="0" w:lastRow="0" w:noHBand="0" w:noVBand="1" w:val="04A0"/>
+      </w:tblPr>
+      <w:tblGrid>
+        <w:gridCol w:w="1656"/>
+        <w:gridCol w:w="1656"/>
+        <w:gridCol w:w="1656"/>
+        <w:gridCol w:w="1656"/>
+        <w:gridCol w:w="1656"/>
+        <w:gridCol w:w="1656"/>
+      </w:tblGrid>
+      <w:tr>
+        <w:tc>
+          <w:tcPr>
+            <w:tcW w:type="dxa" w:w="2304"/>
+            <w:shd w:fill="1A365D"/>
+            <w:tcMar>
+              <w:top w:w="120" w:type="dxa"/>
+              <w:bottom w:w="120" w:type="dxa"/>
+              <w:left w:w="150" w:type="dxa"/>
+              <w:right w:w="150" w:type="dxa"/>
+            </w:tcMar>
+          </w:tcPr>
+          <w:p>
+            <w:pPr>
+              <w:jc w:val="left"/>
+            </w:pPr>
+            <w:r>
+              <w:rPr>
+                <w:rFonts w:ascii="Calibri" w:hAnsi="Calibri"/>
+                <w:b/>
+                <w:color w:val="FFFFFF"/>
+                <w:sz w:val="20"/>
+              </w:rPr>
+              <w:t>Domain Model</w:t>
+            </w:r>
+          </w:p>
+        </w:tc>
+        <w:tc>
+          <w:tcPr>
+            <w:tcW w:type="dxa" w:w="1440"/>
+            <w:shd w:fill="1A365D"/>
+            <w:tcMar>
+              <w:top w:w="120" w:type="dxa"/>
+              <w:bottom w:w="120" w:type="dxa"/>
+              <w:left w:w="150" w:type="dxa"/>
+              <w:right w:w="150" w:type="dxa"/>
+            </w:tcMar>
+          </w:tcPr>
+          <w:p>
+            <w:pPr>
+              <w:jc w:val="left"/>
+            </w:pPr>
+            <w:r>
+              <w:rPr>
+                <w:rFonts w:ascii="Calibri" w:hAnsi="Calibri"/>
+                <w:b/>
+                <w:color w:val="FFFFFF"/>
+                <w:sz w:val="20"/>
+              </w:rPr>
+              <w:t>mAP@0.5</w:t>
+            </w:r>
+          </w:p>
+        </w:tc>
+        <w:tc>
+          <w:tcPr>
+            <w:tcW w:type="dxa" w:w="1440"/>
+            <w:shd w:fill="1A365D"/>
+            <w:tcMar>
+              <w:top w:w="120" w:type="dxa"/>
+              <w:bottom w:w="120" w:type="dxa"/>
+              <w:left w:w="150" w:type="dxa"/>
+              <w:right w:w="150" w:type="dxa"/>
+            </w:tcMar>
+          </w:tcPr>
+          <w:p>
+            <w:pPr>
+              <w:jc w:val="left"/>
+            </w:pPr>
+            <w:r>
+              <w:rPr>
+                <w:rFonts w:ascii="Calibri" w:hAnsi="Calibri"/>
+                <w:b/>
+                <w:color w:val="FFFFFF"/>
+                <w:sz w:val="20"/>
+              </w:rPr>
+              <w:t>mAP@0.5:0.95</w:t>
+            </w:r>
+          </w:p>
+        </w:tc>
+        <w:tc>
+          <w:tcPr>
+            <w:tcW w:type="dxa" w:w="1440"/>
+            <w:shd w:fill="1A365D"/>
+            <w:tcMar>
+              <w:top w:w="120" w:type="dxa"/>
+              <w:bottom w:w="120" w:type="dxa"/>
+              <w:left w:w="150" w:type="dxa"/>
+              <w:right w:w="150" w:type="dxa"/>
+            </w:tcMar>
+          </w:tcPr>
+          <w:p>
+            <w:pPr>
+              <w:jc w:val="left"/>
+            </w:pPr>
+            <w:r>
+              <w:rPr>
+                <w:rFonts w:ascii="Calibri" w:hAnsi="Calibri"/>
+                <w:b/>
+                <w:color w:val="FFFFFF"/>
+                <w:sz w:val="20"/>
+              </w:rPr>
+              <w:t>Precision</w:t>
+            </w:r>
+          </w:p>
+        </w:tc>
+        <w:tc>
+          <w:tcPr>
+            <w:tcW w:type="dxa" w:w="1440"/>
+            <w:shd w:fill="1A365D"/>
+            <w:tcMar>
+              <w:top w:w="120" w:type="dxa"/>
+              <w:bottom w:w="120" w:type="dxa"/>
+              <w:left w:w="150" w:type="dxa"/>
+              <w:right w:w="150" w:type="dxa"/>
+            </w:tcMar>
+          </w:tcPr>
+          <w:p>
+            <w:pPr>
+              <w:jc w:val="left"/>
+            </w:pPr>
+            <w:r>
+              <w:rPr>
+                <w:rFonts w:ascii="Calibri" w:hAnsi="Calibri"/>
+                <w:b/>
+                <w:color w:val="FFFFFF"/>
+                <w:sz w:val="20"/>
+              </w:rPr>
+              <w:t>Recall</w:t>
+            </w:r>
+          </w:p>
+        </w:tc>
+        <w:tc>
+          <w:tcPr>
+            <w:tcW w:type="dxa" w:w="1440"/>
+            <w:shd w:fill="1A365D"/>
+            <w:tcMar>
+              <w:top w:w="120" w:type="dxa"/>
+              <w:bottom w:w="120" w:type="dxa"/>
+              <w:left w:w="150" w:type="dxa"/>
+              <w:right w:w="150" w:type="dxa"/>
+            </w:tcMar>
+          </w:tcPr>
+          <w:p>
+            <w:pPr>
+              <w:jc w:val="left"/>
+            </w:pPr>
+            <w:r>
+              <w:rPr>
+                <w:rFonts w:ascii="Calibri" w:hAnsi="Calibri"/>
+                <w:b/>
+                <w:color w:val="FFFFFF"/>
+                <w:sz w:val="20"/>
+              </w:rPr>
+              <w:t>Instances</w:t>
+            </w:r>
+          </w:p>
+        </w:tc>
+      </w:tr>
+      <w:tr>
+        <w:tc>
+          <w:tcPr>
+            <w:tcW w:type="dxa" w:w="2304"/>
+            <w:shd w:fill="FFFFFF"/>
+            <w:tcMar>
+              <w:top w:w="100" w:type="dxa"/>
+              <w:bottom w:w="100" w:type="dxa"/>
+              <w:left w:w="150" w:type="dxa"/>
+              <w:right w:w="150" w:type="dxa"/>
+            </w:tcMar>
+          </w:tcPr>
+          <w:p>
+            <w:r>
+              <w:rPr>
+                <w:rFonts w:ascii="Calibri" w:hAnsi="Calibri"/>
+                <w:color w:val="2D3748"/>
+                <w:sz w:val="19"/>
+              </w:rPr>
+              <w:t>Agriculture (YOLOv8n)</w:t>
+            </w:r>
+          </w:p>
+        </w:tc>
+        <w:tc>
+          <w:tcPr>
+            <w:tcW w:type="dxa" w:w="1440"/>
+            <w:shd w:fill="FFFFFF"/>
+            <w:tcMar>
+              <w:top w:w="100" w:type="dxa"/>
+              <w:bottom w:w="100" w:type="dxa"/>
+              <w:left w:w="150" w:type="dxa"/>
+              <w:right w:w="150" w:type="dxa"/>
+            </w:tcMar>
+          </w:tcPr>
+          <w:p>
+            <w:r>
+              <w:rPr>
+                <w:rFonts w:ascii="Calibri" w:hAnsi="Calibri"/>
+                <w:color w:val="2D3748"/>
+                <w:sz w:val="19"/>
+              </w:rPr>
+              <w:t>30.4%</w:t>
+            </w:r>
+          </w:p>
+        </w:tc>
+        <w:tc>
+          <w:tcPr>
+            <w:tcW w:type="dxa" w:w="1440"/>
+            <w:shd w:fill="FFFFFF"/>
+            <w:tcMar>
+              <w:top w:w="100" w:type="dxa"/>
+              <w:bottom w:w="100" w:type="dxa"/>
+              <w:left w:w="150" w:type="dxa"/>
+              <w:right w:w="150" w:type="dxa"/>
+            </w:tcMar>
+          </w:tcPr>
+          <w:p>
+            <w:r>
+              <w:rPr>
+                <w:rFonts w:ascii="Calibri" w:hAnsi="Calibri"/>
+                <w:color w:val="2D3748"/>
+                <w:sz w:val="19"/>
+              </w:rPr>
+              <w:t>30.4%</w:t>
+            </w:r>
+          </w:p>
+        </w:tc>
+        <w:tc>
+          <w:tcPr>
+            <w:tcW w:type="dxa" w:w="1440"/>
+            <w:shd w:fill="FFFFFF"/>
+            <w:tcMar>
+              <w:top w:w="100" w:type="dxa"/>
+              <w:bottom w:w="100" w:type="dxa"/>
+              <w:left w:w="150" w:type="dxa"/>
+              <w:right w:w="150" w:type="dxa"/>
+            </w:tcMar>
+          </w:tcPr>
+          <w:p>
+            <w:r>
+              <w:rPr>
+                <w:rFonts w:ascii="Calibri" w:hAnsi="Calibri"/>
+                <w:color w:val="2D3748"/>
+                <w:sz w:val="19"/>
+              </w:rPr>
+              <w:t>25.7%</w:t>
+            </w:r>
+          </w:p>
+        </w:tc>
+        <w:tc>
+          <w:tcPr>
+            <w:tcW w:type="dxa" w:w="1440"/>
+            <w:shd w:fill="FFFFFF"/>
+            <w:tcMar>
+              <w:top w:w="100" w:type="dxa"/>
+              <w:bottom w:w="100" w:type="dxa"/>
+              <w:left w:w="150" w:type="dxa"/>
+              <w:right w:w="150" w:type="dxa"/>
+            </w:tcMar>
+          </w:tcPr>
+          <w:p>
+            <w:r>
+              <w:rPr>
+                <w:rFonts w:ascii="Calibri" w:hAnsi="Calibri"/>
+                <w:color w:val="2D3748"/>
+                <w:sz w:val="19"/>
+              </w:rPr>
+              <w:t>99.8%</w:t>
+            </w:r>
+          </w:p>
+        </w:tc>
+        <w:tc>
+          <w:tcPr>
+            <w:tcW w:type="dxa" w:w="1440"/>
+            <w:shd w:fill="FFFFFF"/>
+            <w:tcMar>
+              <w:top w:w="100" w:type="dxa"/>
+              <w:bottom w:w="100" w:type="dxa"/>
+              <w:left w:w="150" w:type="dxa"/>
+              <w:right w:w="150" w:type="dxa"/>
+            </w:tcMar>
+          </w:tcPr>
+          <w:p>
+            <w:r>
+              <w:rPr>
+                <w:rFonts w:ascii="Calibri" w:hAnsi="Calibri"/>
+                <w:color w:val="2D3748"/>
+                <w:sz w:val="19"/>
+              </w:rPr>
+              <w:t>62 / 245 imgs</w:t>
+            </w:r>
+          </w:p>
+        </w:tc>
+      </w:tr>
+      <w:tr>
+        <w:tc>
+          <w:tcPr>
+            <w:tcW w:type="dxa" w:w="2304"/>
+            <w:shd w:fill="EDF2F7"/>
+            <w:tcMar>
+              <w:top w:w="100" w:type="dxa"/>
+              <w:bottom w:w="100" w:type="dxa"/>
+              <w:left w:w="150" w:type="dxa"/>
+              <w:right w:w="150" w:type="dxa"/>
+            </w:tcMar>
+          </w:tcPr>
+          <w:p>
+            <w:r>
+              <w:rPr>
+                <w:rFonts w:ascii="Calibri" w:hAnsi="Calibri"/>
+                <w:color w:val="2D3748"/>
+                <w:sz w:val="19"/>
+              </w:rPr>
+              <w:t>Ships (YOLO26n)</w:t>
+            </w:r>
+          </w:p>
+        </w:tc>
+        <w:tc>
+          <w:tcPr>
+            <w:tcW w:type="dxa" w:w="1440"/>
+            <w:shd w:fill="EDF2F7"/>
+            <w:tcMar>
+              <w:top w:w="100" w:type="dxa"/>
+              <w:bottom w:w="100" w:type="dxa"/>
+              <w:left w:w="150" w:type="dxa"/>
+              <w:right w:w="150" w:type="dxa"/>
+            </w:tcMar>
+          </w:tcPr>
+          <w:p>
+            <w:r>
+              <w:rPr>
+                <w:rFonts w:ascii="Calibri" w:hAnsi="Calibri"/>
+                <w:color w:val="2D3748"/>
+                <w:sz w:val="19"/>
+              </w:rPr>
+              <w:t>27.6%</w:t>
+            </w:r>
+          </w:p>
+        </w:tc>
+        <w:tc>
+          <w:tcPr>
+            <w:tcW w:type="dxa" w:w="1440"/>
+            <w:shd w:fill="EDF2F7"/>
+            <w:tcMar>
+              <w:top w:w="100" w:type="dxa"/>
+              <w:bottom w:w="100" w:type="dxa"/>
+              <w:left w:w="150" w:type="dxa"/>
+              <w:right w:w="150" w:type="dxa"/>
+            </w:tcMar>
+          </w:tcPr>
+          <w:p>
+            <w:r>
+              <w:rPr>
+                <w:rFonts w:ascii="Calibri" w:hAnsi="Calibri"/>
+                <w:color w:val="2D3748"/>
+                <w:sz w:val="19"/>
+              </w:rPr>
+              <w:t>27.6%</w:t>
+            </w:r>
+          </w:p>
+        </w:tc>
+        <w:tc>
+          <w:tcPr>
+            <w:tcW w:type="dxa" w:w="1440"/>
+            <w:shd w:fill="EDF2F7"/>
+            <w:tcMar>
+              <w:top w:w="100" w:type="dxa"/>
+              <w:bottom w:w="100" w:type="dxa"/>
+              <w:left w:w="150" w:type="dxa"/>
+              <w:right w:w="150" w:type="dxa"/>
+            </w:tcMar>
+          </w:tcPr>
+          <w:p>
+            <w:r>
+              <w:rPr>
+                <w:rFonts w:ascii="Calibri" w:hAnsi="Calibri"/>
+                <w:color w:val="2D3748"/>
+                <w:sz w:val="19"/>
+              </w:rPr>
+              <w:t>25.3%</w:t>
+            </w:r>
+          </w:p>
+        </w:tc>
+        <w:tc>
+          <w:tcPr>
+            <w:tcW w:type="dxa" w:w="1440"/>
+            <w:shd w:fill="EDF2F7"/>
+            <w:tcMar>
+              <w:top w:w="100" w:type="dxa"/>
+              <w:bottom w:w="100" w:type="dxa"/>
+              <w:left w:w="150" w:type="dxa"/>
+              <w:right w:w="150" w:type="dxa"/>
+            </w:tcMar>
+          </w:tcPr>
+          <w:p>
+            <w:r>
+              <w:rPr>
+                <w:rFonts w:ascii="Calibri" w:hAnsi="Calibri"/>
+                <w:color w:val="2D3748"/>
+                <w:sz w:val="19"/>
+              </w:rPr>
+              <w:t>100.0%</w:t>
+            </w:r>
+          </w:p>
+        </w:tc>
+        <w:tc>
+          <w:tcPr>
+            <w:tcW w:type="dxa" w:w="1440"/>
+            <w:shd w:fill="EDF2F7"/>
+            <w:tcMar>
+              <w:top w:w="100" w:type="dxa"/>
+              <w:bottom w:w="100" w:type="dxa"/>
+              <w:left w:w="150" w:type="dxa"/>
+              <w:right w:w="150" w:type="dxa"/>
+            </w:tcMar>
+          </w:tcPr>
+          <w:p>
+            <w:r>
+              <w:rPr>
+                <w:rFonts w:ascii="Calibri" w:hAnsi="Calibri"/>
+                <w:color w:val="2D3748"/>
+                <w:sz w:val="19"/>
+              </w:rPr>
+              <w:t>57 / 213 imgs</w:t>
+            </w:r>
+          </w:p>
+        </w:tc>
+      </w:tr>
+      <w:tr>
+        <w:tc>
+          <w:tcPr>
+            <w:tcW w:type="dxa" w:w="2304"/>
+            <w:shd w:fill="FFFFFF"/>
+            <w:tcMar>
+              <w:top w:w="100" w:type="dxa"/>
+              <w:bottom w:w="100" w:type="dxa"/>
+              <w:left w:w="150" w:type="dxa"/>
+              <w:right w:w="150" w:type="dxa"/>
+            </w:tcMar>
+          </w:tcPr>
+          <w:p>
+            <w:r>
+              <w:rPr>
+                <w:rFonts w:ascii="Calibri" w:hAnsi="Calibri"/>
+                <w:color w:val="2D3748"/>
+                <w:sz w:val="19"/>
+              </w:rPr>
+              <w:t>Space (YOLO26n)</w:t>
+            </w:r>
+          </w:p>
+        </w:tc>
+        <w:tc>
+          <w:tcPr>
+            <w:tcW w:type="dxa" w:w="1440"/>
+            <w:shd w:fill="FFFFFF"/>
+            <w:tcMar>
+              <w:top w:w="100" w:type="dxa"/>
+              <w:bottom w:w="100" w:type="dxa"/>
+              <w:left w:w="150" w:type="dxa"/>
+              <w:right w:w="150" w:type="dxa"/>
+            </w:tcMar>
+          </w:tcPr>
+          <w:p>
+            <w:r>
+              <w:rPr>
+                <w:rFonts w:ascii="Calibri" w:hAnsi="Calibri"/>
+                <w:color w:val="2D3748"/>
+                <w:sz w:val="19"/>
+              </w:rPr>
+              <w:t>20.5%</w:t>
+            </w:r>
+          </w:p>
+        </w:tc>
+        <w:tc>
+          <w:tcPr>
+            <w:tcW w:type="dxa" w:w="1440"/>
+            <w:shd w:fill="FFFFFF"/>
+            <w:tcMar>
+              <w:top w:w="100" w:type="dxa"/>
+              <w:bottom w:w="100" w:type="dxa"/>
+              <w:left w:w="150" w:type="dxa"/>
+              <w:right w:w="150" w:type="dxa"/>
+            </w:tcMar>
+          </w:tcPr>
+          <w:p>
+            <w:r>
+              <w:rPr>
+                <w:rFonts w:ascii="Calibri" w:hAnsi="Calibri"/>
+                <w:color w:val="2D3748"/>
+                <w:sz w:val="19"/>
+              </w:rPr>
+              <w:t>20.5%</w:t>
+            </w:r>
+          </w:p>
+        </w:tc>
+        <w:tc>
+          <w:tcPr>
+            <w:tcW w:type="dxa" w:w="1440"/>
+            <w:shd w:fill="FFFFFF"/>
+            <w:tcMar>
+              <w:top w:w="100" w:type="dxa"/>
+              <w:bottom w:w="100" w:type="dxa"/>
+              <w:left w:w="150" w:type="dxa"/>
+              <w:right w:w="150" w:type="dxa"/>
+            </w:tcMar>
+          </w:tcPr>
+          <w:p>
+            <w:r>
+              <w:rPr>
+                <w:rFonts w:ascii="Calibri" w:hAnsi="Calibri"/>
+                <w:color w:val="2D3748"/>
+                <w:sz w:val="19"/>
+              </w:rPr>
+              <w:t>18.6%</w:t>
+            </w:r>
+          </w:p>
+        </w:tc>
+        <w:tc>
+          <w:tcPr>
+            <w:tcW w:type="dxa" w:w="1440"/>
+            <w:shd w:fill="FFFFFF"/>
+            <w:tcMar>
+              <w:top w:w="100" w:type="dxa"/>
+              <w:bottom w:w="100" w:type="dxa"/>
+              <w:left w:w="150" w:type="dxa"/>
+              <w:right w:w="150" w:type="dxa"/>
+            </w:tcMar>
+          </w:tcPr>
+          <w:p>
+            <w:r>
+              <w:rPr>
+                <w:rFonts w:ascii="Calibri" w:hAnsi="Calibri"/>
+                <w:color w:val="2D3748"/>
+                <w:sz w:val="19"/>
+              </w:rPr>
+              <w:t>64.6%</w:t>
+            </w:r>
+          </w:p>
+        </w:tc>
+        <w:tc>
+          <w:tcPr>
+            <w:tcW w:type="dxa" w:w="1440"/>
+            <w:shd w:fill="FFFFFF"/>
+            <w:tcMar>
+              <w:top w:w="100" w:type="dxa"/>
+              <w:bottom w:w="100" w:type="dxa"/>
+              <w:left w:w="150" w:type="dxa"/>
+              <w:right w:w="150" w:type="dxa"/>
+            </w:tcMar>
+          </w:tcPr>
+          <w:p>
+            <w:r>
+              <w:rPr>
+                <w:rFonts w:ascii="Calibri" w:hAnsi="Calibri"/>
+                <w:color w:val="2D3748"/>
+                <w:sz w:val="19"/>
+              </w:rPr>
+              <w:t>44 / 220 imgs</w:t>
+            </w:r>
+          </w:p>
+        </w:tc>
+      </w:tr>
+    </w:tbl>
+    <w:p>
+      <w:pPr>
+        <w:spacing w:after="160"/>
+      </w:pPr>
+    </w:p>
+    <w:p>
+      <w:r>
+        <w:t>Critical Takeaway for Team 5C:</w:t>
+        <w:br/>
+        <w:t>Notice that Recall is nearly 100% across Agriculture and Ships, while Precision is ~25%. This is the mathematical signature of the Full-Frame Pseudo-Box issue: the supplied models were trained on synthetic images where the bounding box was set to the entire image (width=1.0, height=1.0). Consequently, the model fires a full-frame prediction on every target image (achieving 100% recall), but on unannotated background images (which comprise ~70% of validation sets), it generates false positives, reducing precision to 25%.</w:t>
+      </w:r>
+    </w:p>
+    <w:p>
+      <w:pPr>
+        <w:pStyle w:val="Heading2"/>
+      </w:pPr>
+      <w:r>
+        <w:t>12.3 Exact UI Rendering Guidelines for Team 5C</w:t>
+      </w:r>
+    </w:p>
+    <w:p>
+      <w:r>
+        <w:t>Team 5B embedded automated pseudo-box detection directly into the telemetry payload via the boolean flag 'is_pseudo_box'. Team 5C's UI dashboard should implement the following conditional rendering logic:</w:t>
+        <w:br/>
+        <w:br/>
+        <w:t>• CASE 1 — When 'is_pseudo_box': true</w:t>
+        <w:br/>
+        <w:t xml:space="preserve">  The detection represents a full-frame synthetic classification alert rather than a localized object.</w:t>
+        <w:br/>
+        <w:t xml:space="preserve">  -&gt; UI Action: Display an Image-Level Alert Banner / Badge on the dashboard (e.g. 'WARNING: Cargo Ship Detected in Sector' or 'DEFECT: Short Circuit Anomaly Detected'). Do NOT draw a giant box over the entire frame.</w:t>
+        <w:br/>
+        <w:br/>
+        <w:t>• CASE 2 — When 'is_pseudo_box': false</w:t>
+        <w:br/>
+        <w:t xml:space="preserve">  The detection represents a real, localized object with sub-frame coordinates.</w:t>
+        <w:br/>
+        <w:t xml:space="preserve">  -&gt; UI Action: Draw a standard bounding box canvas overlay using (x_min, y_min, x_max, y_max) scaled to the display canvas resolution.</w:t>
+      </w:r>
+    </w:p>
+    <w:p>
+      <w:pPr>
+        <w:pStyle w:val="Heading2"/>
+      </w:pPr>
+      <w:r>
+        <w:t>12.4 Quick-Start Ingestion Code for Team 5C (JavaScript / Node.js)</w:t>
+      </w:r>
+    </w:p>
+    <w:p>
+      <w:r>
+        <w:t>Team 5C can connect their dashboard to Team 5B's live stream using this client snippet:</w:t>
+        <w:br/>
+        <w:t>const mqtt = require('mqtt');</w:t>
+        <w:br/>
+        <w:t>const client = mqtt.connect('mqtt://localhost:1883');</w:t>
+        <w:br/>
+        <w:br/>
+        <w:t>client.on('connect', () =&gt; {</w:t>
+        <w:br/>
+        <w:t xml:space="preserve">  console.log('Connected to Team 5B Edge Stream');</w:t>
+        <w:br/>
+        <w:t xml:space="preserve">  client.subscribe('telemetry/edge/team5b/inference', { qos: 1 });</w:t>
+        <w:br/>
+        <w:t>});</w:t>
+        <w:br/>
+        <w:br/>
+        <w:t>client.on('message', (topic, message) =&gt; {</w:t>
+        <w:br/>
+        <w:t xml:space="preserve">  const payload = JSON.parse(message.toString());</w:t>
+        <w:br/>
+        <w:t xml:space="preserve">  payload.detections.forEach(det =&gt; {</w:t>
+        <w:br/>
+        <w:t xml:space="preserve">    if (det.box.is_pseudo_box) {</w:t>
+        <w:br/>
+        <w:t xml:space="preserve">      renderClassificationBadge(det.global_class_name, det.confidence);</w:t>
+        <w:br/>
+        <w:t xml:space="preserve">    } else {</w:t>
+        <w:br/>
+        <w:t xml:space="preserve">      drawBoundingBox(det.box, det.global_class_name);</w:t>
+        <w:br/>
+        <w:t xml:space="preserve">    }</w:t>
+        <w:br/>
+        <w:t xml:space="preserve">  });</w:t>
+        <w:br/>
+        <w:t>});</w:t>
+      </w:r>
+    </w:p>
     <w:sectPr>
       <w:pgSz w:w="12240" w:h="15840"/>
       <w:pgMar w:top="1152" w:right="1152" w:bottom="1152" w:left="1152" w:header="720" w:footer="720" w:gutter="0"/>

</xml_diff>